<commit_message>
feature: add project mockup [ 0.1.0]
</commit_message>
<xml_diff>
--- a/docs/CCT_STDA_CA_01_40S_2026438.docx
+++ b/docs/CCT_STDA_CA_01_40S_2026438.docx
@@ -728,33 +728,7 @@
                 <w:lang w:val="en-IE" w:eastAsia="en-IE"/>
                 <w14:ligatures w14:val="none"/>
               </w:rPr>
-              <w:t>2026-1</w:t>
-            </w:r>
-            <w:r>
-              <w:rPr>
-                <w:rFonts w:ascii="Calibri" w:eastAsia="Calibri" w:hAnsi="Calibri" w:cs="Calibri"/>
-                <w:i/>
-                <w:color w:val="156082"/>
-                <w:kern w:val="0"/>
-                <w:sz w:val="28"/>
-                <w:szCs w:val="28"/>
-                <w:lang w:val="en-IE" w:eastAsia="en-IE"/>
-                <w14:ligatures w14:val="none"/>
-              </w:rPr>
-              <w:t>1-01</w:t>
-            </w:r>
-            <w:r>
-              <w:rPr>
-                <w:rFonts w:ascii="Calibri" w:eastAsia="Calibri" w:hAnsi="Calibri" w:cs="Calibri"/>
-                <w:i/>
-                <w:color w:val="156082"/>
-                <w:kern w:val="0"/>
-                <w:sz w:val="28"/>
-                <w:szCs w:val="28"/>
-                <w:lang w:val="en-IE" w:eastAsia="en-IE"/>
-                <w14:ligatures w14:val="none"/>
-              </w:rPr>
-              <w:t xml:space="preserve"> </w:t>
+              <w:t xml:space="preserve">2026-11-01 </w:t>
             </w:r>
             <w:r>
               <w:rPr>
@@ -805,7 +779,7 @@
                           </pic:cNvPicPr>
                         </pic:nvPicPr>
                         <pic:blipFill>
-                          <a:blip r:embed="rId6">
+                          <a:blip r:embed="rId8">
                             <a:extLst>
                               <a:ext uri="{28A0092B-C50C-407E-A947-70E740481C1C}">
                                 <a14:useLocalDpi xmlns:a14="http://schemas.microsoft.com/office/drawing/2010/main" val="0"/>
@@ -893,7 +867,7 @@
                           </pic:cNvPicPr>
                         </pic:nvPicPr>
                         <pic:blipFill>
-                          <a:blip r:embed="rId6">
+                          <a:blip r:embed="rId8">
                             <a:extLst>
                               <a:ext uri="{28A0092B-C50C-407E-A947-70E740481C1C}">
                                 <a14:useLocalDpi xmlns:a14="http://schemas.microsoft.com/office/drawing/2010/main" val="0"/>
@@ -981,7 +955,7 @@
                           </pic:cNvPicPr>
                         </pic:nvPicPr>
                         <pic:blipFill>
-                          <a:blip r:embed="rId6">
+                          <a:blip r:embed="rId8">
                             <a:extLst>
                               <a:ext uri="{28A0092B-C50C-407E-A947-70E740481C1C}">
                                 <a14:useLocalDpi xmlns:a14="http://schemas.microsoft.com/office/drawing/2010/main" val="0"/>
@@ -1078,7 +1052,7 @@
                 <w14:ligatures w14:val="none"/>
               </w:rPr>
             </w:pPr>
-            <w:hyperlink r:id="rId7" w:history="1">
+            <w:hyperlink r:id="rId9" w:history="1">
               <w:r>
                 <w:rPr>
                   <w:rFonts w:ascii="Calibri" w:eastAsia="Calibri" w:hAnsi="Calibri" w:cs="Calibri"/>
@@ -1091,35 +1065,7 @@
                   <w:lang w:val="en-IE" w:eastAsia="en-IE"/>
                   <w14:ligatures w14:val="none"/>
                 </w:rPr>
-                <w:t>CCT-Dublin/CCT_STDA_C</w:t>
-              </w:r>
-              <w:r>
-                <w:rPr>
-                  <w:rFonts w:ascii="Calibri" w:eastAsia="Calibri" w:hAnsi="Calibri" w:cs="Calibri"/>
-                  <w:i/>
-                  <w:color w:val="156082"/>
-                  <w:kern w:val="0"/>
-                  <w:sz w:val="28"/>
-                  <w:szCs w:val="28"/>
-                  <w:u w:val="single"/>
-                  <w:lang w:val="en-IE" w:eastAsia="en-IE"/>
-                  <w14:ligatures w14:val="none"/>
-                </w:rPr>
-                <w:t>A</w:t>
-              </w:r>
-              <w:r>
-                <w:rPr>
-                  <w:rFonts w:ascii="Calibri" w:eastAsia="Calibri" w:hAnsi="Calibri" w:cs="Calibri"/>
-                  <w:i/>
-                  <w:color w:val="156082"/>
-                  <w:kern w:val="0"/>
-                  <w:sz w:val="28"/>
-                  <w:szCs w:val="28"/>
-                  <w:u w:val="single"/>
-                  <w:lang w:val="en-IE" w:eastAsia="en-IE"/>
-                  <w14:ligatures w14:val="none"/>
-                </w:rPr>
-                <w:t>_01_40S</w:t>
+                <w:t>CCT-Dublin/CCT_STDA_CA_01_40S</w:t>
               </w:r>
             </w:hyperlink>
           </w:p>
@@ -1341,7 +1287,7 @@
                     <pic:cNvPicPr/>
                   </pic:nvPicPr>
                   <pic:blipFill>
-                    <a:blip r:embed="rId8"/>
+                    <a:blip r:embed="rId10"/>
                     <a:stretch>
                       <a:fillRect/>
                     </a:stretch>
@@ -1382,6 +1328,16 @@
     <w:customXmlInsRangeStart w:id="2" w:author="MatheuS Santos" w:date="2026-10-25T10:38:00Z"/>
     <w:sdt>
       <w:sdtPr>
+        <w:rPr>
+          <w:rFonts w:asciiTheme="minorHAnsi" w:eastAsiaTheme="minorHAnsi" w:hAnsiTheme="minorHAnsi" w:cstheme="minorBidi"/>
+          <w:b w:val="0"/>
+          <w:bCs w:val="0"/>
+          <w:color w:val="auto"/>
+          <w:kern w:val="2"/>
+          <w:sz w:val="24"/>
+          <w:szCs w:val="24"/>
+          <w14:ligatures w14:val="standardContextual"/>
+        </w:rPr>
         <w:id w:val="370499433"/>
         <w:docPartObj>
           <w:docPartGallery w:val="Table of Contents"/>
@@ -1390,13 +1346,7 @@
       </w:sdtPr>
       <w:sdtEndPr>
         <w:rPr>
-          <w:rFonts w:asciiTheme="minorHAnsi" w:eastAsiaTheme="minorHAnsi" w:hAnsiTheme="minorHAnsi" w:cstheme="minorBidi"/>
           <w:noProof/>
-          <w:color w:val="auto"/>
-          <w:kern w:val="2"/>
-          <w:sz w:val="24"/>
-          <w:szCs w:val="24"/>
-          <w14:ligatures w14:val="standardContextual"/>
         </w:rPr>
       </w:sdtEndPr>
       <w:sdtContent>
@@ -1449,21 +1399,7 @@
                 <w:rStyle w:val="Hyperlink"/>
                 <w:noProof/>
               </w:rPr>
-              <w:t>1.      Summarize your dataset clearly, using relevant descriptive statistics and appropriate p</w:t>
-            </w:r>
-            <w:r>
-              <w:rPr>
-                <w:rStyle w:val="Hyperlink"/>
-                <w:noProof/>
-              </w:rPr>
-              <w:t>l</w:t>
-            </w:r>
-            <w:r>
-              <w:rPr>
-                <w:rStyle w:val="Hyperlink"/>
-                <w:noProof/>
-              </w:rPr>
-              <w:t>ots. These should be carefully motivated and justified and clearly presented. You should critically analyse your findings, in addition to including the necessary Python code, output and plots in the report. You are required to plot at least three graphs. [0-35].</w:t>
+              <w:t>1.      Summarize your dataset clearly, using relevant descriptive statistics and appropriate plots. These should be carefully motivated and justified and clearly presented. You should critically analyse your findings, in addition to including the necessary Python code, output and plots in the report. You are required to plot at least three graphs. [0-35].</w:t>
             </w:r>
             <w:r>
               <w:rPr>
@@ -2120,13 +2056,7 @@
       </w:pPr>
       <w:bookmarkStart w:id="24" w:name="_Toc243817126"/>
       <w:r>
-        <w:t>6</w:t>
-      </w:r>
-      <w:r>
-        <w:t>. References</w:t>
-      </w:r>
-      <w:r>
-        <w:t>.</w:t>
+        <w:t>6. References.</w:t>
       </w:r>
       <w:bookmarkEnd w:id="24"/>
     </w:p>
@@ -2143,6 +2073,7 @@
     </w:p>
     <w:p/>
     <w:sectPr>
+      <w:headerReference w:type="default" r:id="rId11"/>
       <w:pgSz w:w="12240" w:h="15840"/>
       <w:pgMar w:top="1440" w:right="1440" w:bottom="1440" w:left="1440" w:header="720" w:footer="720" w:gutter="0"/>
       <w:cols w:space="720"/>
@@ -2150,6 +2081,122 @@
     </w:sectPr>
   </w:body>
 </w:document>
+</file>
+
+<file path=word/endnotes.xml><?xml version="1.0" encoding="utf-8"?>
+<w:endnotes xmlns:wpc="http://schemas.microsoft.com/office/word/2010/wordprocessingCanvas" xmlns:cx="http://schemas.microsoft.com/office/drawing/2014/chartex" xmlns:cx1="http://schemas.microsoft.com/office/drawing/2015/9/8/chartex" xmlns:cx2="http://schemas.microsoft.com/office/drawing/2015/10/21/chartex" xmlns:cx3="http://schemas.microsoft.com/office/drawing/2016/5/9/chartex" xmlns:cx4="http://schemas.microsoft.com/office/drawing/2016/5/10/chartex" xmlns:cx5="http://schemas.microsoft.com/office/drawing/2016/5/11/chartex" xmlns:cx6="http://schemas.microsoft.com/office/drawing/2016/5/12/chartex" xmlns:cx7="http://schemas.microsoft.com/office/drawing/2016/5/13/chartex" xmlns:cx8="http://schemas.microsoft.com/office/drawing/2016/5/14/chartex" xmlns:mc="http://schemas.openxmlformats.org/markup-compatibility/2006" xmlns:m="http://schemas.openxmlformats.org/officeDocument/2006/math" xmlns:aink="http://schemas.microsoft.com/office/drawing/2016/ink" xmlns:am3d="http://schemas.microsoft.com/office/drawing/2017/model3d" xmlns:oel="http://schemas.microsoft.com/office/2019/extlst" xmlns:r="http://schemas.openxmlformats.org/officeDocument/2006/relationships" xmlns:wp14="http://schemas.microsoft.com/office/word/2010/wordprocessingDrawing" xmlns:wp="http://schemas.openxmlformats.org/drawingml/2006/wordprocessingDrawing" xmlns:wpg="http://schemas.microsoft.com/office/word/2010/wordprocessingGroup" xmlns:wpi="http://schemas.microsoft.com/office/word/2010/wordprocessingInk" xmlns:wps="http://schemas.microsoft.com/office/word/2010/wordprocessingShape" xmlns:o="urn:schemas-microsoft-com:office:office" xmlns:v="urn:schemas-microsoft-com:vml" xmlns:w10="urn:schemas-microsoft-com:office:word" xmlns:w="http://schemas.openxmlformats.org/wordprocessingml/2006/main" xmlns:w14="http://schemas.microsoft.com/office/word/2010/wordml" xmlns:w15="http://schemas.microsoft.com/office/word/2012/wordml" xmlns:w16cex="http://schemas.microsoft.com/office/word/2018/wordml/cex" xmlns:w16cid="http://schemas.microsoft.com/office/word/2016/wordml/cid" xmlns:w16="http://schemas.microsoft.com/office/word/2018/wordml" xmlns:w16sdtdh="http://schemas.microsoft.com/office/word/2020/wordml/sdtdatahash" xmlns:w16sdtfl="http://schemas.microsoft.com/office/word/2024/wordml/sdtformatlock" xmlns:w16se="http://schemas.microsoft.com/office/word/2015/wordml/symex" xmlns:w16du="http://schemas.microsoft.com/office/word/2023/wordml/word16du" xmlns:wne="http://schemas.microsoft.com/office/word/2006/wordml" mc:Ignorable="w14 w15 w16se w16cid w16 w16cex w16sdtdh w16sdtfl w16du wp14">
+  <w:endnote w:type="separator" w:id="-1">
+    <w:p>
+      <w:pPr>
+        <w:spacing w:after="0" w:line="240" w:lineRule="auto"/>
+      </w:pPr>
+      <w:r>
+        <w:separator/>
+      </w:r>
+    </w:p>
+  </w:endnote>
+  <w:endnote w:type="continuationSeparator" w:id="0">
+    <w:p>
+      <w:pPr>
+        <w:spacing w:after="0" w:line="240" w:lineRule="auto"/>
+      </w:pPr>
+      <w:r>
+        <w:continuationSeparator/>
+      </w:r>
+    </w:p>
+  </w:endnote>
+</w:endnotes>
+</file>
+
+<file path=word/footnotes.xml><?xml version="1.0" encoding="utf-8"?>
+<w:footnotes xmlns:wpc="http://schemas.microsoft.com/office/word/2010/wordprocessingCanvas" xmlns:cx="http://schemas.microsoft.com/office/drawing/2014/chartex" xmlns:cx1="http://schemas.microsoft.com/office/drawing/2015/9/8/chartex" xmlns:cx2="http://schemas.microsoft.com/office/drawing/2015/10/21/chartex" xmlns:cx3="http://schemas.microsoft.com/office/drawing/2016/5/9/chartex" xmlns:cx4="http://schemas.microsoft.com/office/drawing/2016/5/10/chartex" xmlns:cx5="http://schemas.microsoft.com/office/drawing/2016/5/11/chartex" xmlns:cx6="http://schemas.microsoft.com/office/drawing/2016/5/12/chartex" xmlns:cx7="http://schemas.microsoft.com/office/drawing/2016/5/13/chartex" xmlns:cx8="http://schemas.microsoft.com/office/drawing/2016/5/14/chartex" xmlns:mc="http://schemas.openxmlformats.org/markup-compatibility/2006" xmlns:m="http://schemas.openxmlformats.org/officeDocument/2006/math" xmlns:aink="http://schemas.microsoft.com/office/drawing/2016/ink" xmlns:am3d="http://schemas.microsoft.com/office/drawing/2017/model3d" xmlns:oel="http://schemas.microsoft.com/office/2019/extlst" xmlns:r="http://schemas.openxmlformats.org/officeDocument/2006/relationships" xmlns:wp14="http://schemas.microsoft.com/office/word/2010/wordprocessingDrawing" xmlns:wp="http://schemas.openxmlformats.org/drawingml/2006/wordprocessingDrawing" xmlns:wpg="http://schemas.microsoft.com/office/word/2010/wordprocessingGroup" xmlns:wpi="http://schemas.microsoft.com/office/word/2010/wordprocessingInk" xmlns:wps="http://schemas.microsoft.com/office/word/2010/wordprocessingShape" xmlns:o="urn:schemas-microsoft-com:office:office" xmlns:v="urn:schemas-microsoft-com:vml" xmlns:w10="urn:schemas-microsoft-com:office:word" xmlns:w="http://schemas.openxmlformats.org/wordprocessingml/2006/main" xmlns:w14="http://schemas.microsoft.com/office/word/2010/wordml" xmlns:w15="http://schemas.microsoft.com/office/word/2012/wordml" xmlns:w16cex="http://schemas.microsoft.com/office/word/2018/wordml/cex" xmlns:w16cid="http://schemas.microsoft.com/office/word/2016/wordml/cid" xmlns:w16="http://schemas.microsoft.com/office/word/2018/wordml" xmlns:w16sdtdh="http://schemas.microsoft.com/office/word/2020/wordml/sdtdatahash" xmlns:w16sdtfl="http://schemas.microsoft.com/office/word/2024/wordml/sdtformatlock" xmlns:w16se="http://schemas.microsoft.com/office/word/2015/wordml/symex" xmlns:w16du="http://schemas.microsoft.com/office/word/2023/wordml/word16du" xmlns:wne="http://schemas.microsoft.com/office/word/2006/wordml" mc:Ignorable="w14 w15 w16se w16cid w16 w16cex w16sdtdh w16sdtfl w16du wp14">
+  <w:footnote w:type="separator" w:id="-1">
+    <w:p>
+      <w:pPr>
+        <w:spacing w:after="0" w:line="240" w:lineRule="auto"/>
+      </w:pPr>
+      <w:r>
+        <w:separator/>
+      </w:r>
+    </w:p>
+  </w:footnote>
+  <w:footnote w:type="continuationSeparator" w:id="0">
+    <w:p>
+      <w:pPr>
+        <w:spacing w:after="0" w:line="240" w:lineRule="auto"/>
+      </w:pPr>
+      <w:r>
+        <w:continuationSeparator/>
+      </w:r>
+    </w:p>
+  </w:footnote>
+</w:footnotes>
+</file>
+
+<file path=word/header1.xml><?xml version="1.0" encoding="utf-8"?>
+<w:hdr xmlns:wpc="http://schemas.microsoft.com/office/word/2010/wordprocessingCanvas" xmlns:cx="http://schemas.microsoft.com/office/drawing/2014/chartex" xmlns:cx1="http://schemas.microsoft.com/office/drawing/2015/9/8/chartex" xmlns:cx2="http://schemas.microsoft.com/office/drawing/2015/10/21/chartex" xmlns:cx3="http://schemas.microsoft.com/office/drawing/2016/5/9/chartex" xmlns:cx4="http://schemas.microsoft.com/office/drawing/2016/5/10/chartex" xmlns:cx5="http://schemas.microsoft.com/office/drawing/2016/5/11/chartex" xmlns:cx6="http://schemas.microsoft.com/office/drawing/2016/5/12/chartex" xmlns:cx7="http://schemas.microsoft.com/office/drawing/2016/5/13/chartex" xmlns:cx8="http://schemas.microsoft.com/office/drawing/2016/5/14/chartex" xmlns:mc="http://schemas.openxmlformats.org/markup-compatibility/2006" xmlns:m="http://schemas.openxmlformats.org/officeDocument/2006/math" xmlns:aink="http://schemas.microsoft.com/office/drawing/2016/ink" xmlns:am3d="http://schemas.microsoft.com/office/drawing/2017/model3d" xmlns:oel="http://schemas.microsoft.com/office/2019/extlst" xmlns:r="http://schemas.openxmlformats.org/officeDocument/2006/relationships" xmlns:wp14="http://schemas.microsoft.com/office/word/2010/wordprocessingDrawing" xmlns:wp="http://schemas.openxmlformats.org/drawingml/2006/wordprocessingDrawing" xmlns:wpg="http://schemas.microsoft.com/office/word/2010/wordprocessingGroup" xmlns:wpi="http://schemas.microsoft.com/office/word/2010/wordprocessingInk" xmlns:wps="http://schemas.microsoft.com/office/word/2010/wordprocessingShape" xmlns:o="urn:schemas-microsoft-com:office:office" xmlns:v="urn:schemas-microsoft-com:vml" xmlns:w10="urn:schemas-microsoft-com:office:word" xmlns:w="http://schemas.openxmlformats.org/wordprocessingml/2006/main" xmlns:w14="http://schemas.microsoft.com/office/word/2010/wordml" xmlns:w15="http://schemas.microsoft.com/office/word/2012/wordml" xmlns:w16cex="http://schemas.microsoft.com/office/word/2018/wordml/cex" xmlns:w16cid="http://schemas.microsoft.com/office/word/2016/wordml/cid" xmlns:w16="http://schemas.microsoft.com/office/word/2018/wordml" xmlns:w16sdtdh="http://schemas.microsoft.com/office/word/2020/wordml/sdtdatahash" xmlns:w16sdtfl="http://schemas.microsoft.com/office/word/2024/wordml/sdtformatlock" xmlns:w16se="http://schemas.microsoft.com/office/word/2015/wordml/symex" xmlns:w16du="http://schemas.microsoft.com/office/word/2023/wordml/word16du" xmlns:wne="http://schemas.microsoft.com/office/word/2006/wordml" mc:Ignorable="w14 w15 w16se w16cid w16 w16cex w16sdtdh w16sdtfl w16du wp14">
+  <w:p>
+    <w:pPr>
+      <w:pStyle w:val="Header"/>
+    </w:pPr>
+    <w:ins w:id="26" w:author="MatheuS Santos" w:date="2026-10-25T11:38:00Z" w16du:dateUtc="2026-10-25T11:38:00Z">
+      <w:r>
+        <w:rPr>
+          <w:noProof/>
+        </w:rPr>
+        <w:drawing>
+          <wp:anchor distT="0" distB="0" distL="114300" distR="114300" simplePos="0" relativeHeight="251659264" behindDoc="0" locked="0" layoutInCell="1" hidden="0" allowOverlap="1" wp14:anchorId="2D0BDF14" wp14:editId="7B7EDEAE">
+            <wp:simplePos x="0" y="0"/>
+            <wp:positionH relativeFrom="margin">
+              <wp:posOffset>5255491</wp:posOffset>
+            </wp:positionH>
+            <wp:positionV relativeFrom="margin">
+              <wp:posOffset>-743470</wp:posOffset>
+            </wp:positionV>
+            <wp:extent cx="1291590" cy="535305"/>
+            <wp:effectExtent l="0" t="0" r="3810" b="0"/>
+            <wp:wrapSquare wrapText="bothSides" distT="0" distB="0" distL="114300" distR="114300"/>
+            <wp:docPr id="1728545883" name="image1.png" descr="A logo for college computing&#10;&#10;Description automatically generated"/>
+            <wp:cNvGraphicFramePr/>
+            <a:graphic xmlns:a="http://schemas.openxmlformats.org/drawingml/2006/main">
+              <a:graphicData uri="http://schemas.openxmlformats.org/drawingml/2006/picture">
+                <pic:pic xmlns:pic="http://schemas.openxmlformats.org/drawingml/2006/picture">
+                  <pic:nvPicPr>
+                    <pic:cNvPr id="0" name="image1.png" descr="A logo for college computing&#10;&#10;Description automatically generated"/>
+                    <pic:cNvPicPr preferRelativeResize="0"/>
+                  </pic:nvPicPr>
+                  <pic:blipFill>
+                    <a:blip r:embed="rId1"/>
+                    <a:srcRect/>
+                    <a:stretch>
+                      <a:fillRect/>
+                    </a:stretch>
+                  </pic:blipFill>
+                  <pic:spPr>
+                    <a:xfrm>
+                      <a:off x="0" y="0"/>
+                      <a:ext cx="1291590" cy="535305"/>
+                    </a:xfrm>
+                    <a:prstGeom prst="rect">
+                      <a:avLst/>
+                    </a:prstGeom>
+                    <a:ln/>
+                  </pic:spPr>
+                </pic:pic>
+              </a:graphicData>
+            </a:graphic>
+            <wp14:sizeRelH relativeFrom="margin">
+              <wp14:pctWidth>0</wp14:pctWidth>
+            </wp14:sizeRelH>
+            <wp14:sizeRelV relativeFrom="margin">
+              <wp14:pctHeight>0</wp14:pctHeight>
+            </wp14:sizeRelV>
+          </wp:anchor>
+        </w:drawing>
+      </w:r>
+    </w:ins>
+  </w:p>
+</w:hdr>
 </file>
 
 <file path=word/numbering.xml><?xml version="1.0" encoding="utf-8"?>
@@ -3539,6 +3586,50 @@
       <w:szCs w:val="20"/>
     </w:rPr>
   </w:style>
+  <w:style w:type="paragraph" w:styleId="Header">
+    <w:name w:val="header"/>
+    <w:basedOn w:val="Normal"/>
+    <w:link w:val="HeaderChar"/>
+    <w:uiPriority w:val="99"/>
+    <w:unhideWhenUsed/>
+    <w:rsid w:val="00E866E3"/>
+    <w:pPr>
+      <w:tabs>
+        <w:tab w:val="center" w:pos="4680"/>
+        <w:tab w:val="right" w:pos="9360"/>
+      </w:tabs>
+      <w:spacing w:after="0" w:line="240" w:lineRule="auto"/>
+    </w:pPr>
+  </w:style>
+  <w:style w:type="character" w:customStyle="1" w:styleId="HeaderChar">
+    <w:name w:val="Header Char"/>
+    <w:basedOn w:val="DefaultParagraphFont"/>
+    <w:link w:val="Header"/>
+    <w:uiPriority w:val="99"/>
+    <w:rsid w:val="00E866E3"/>
+  </w:style>
+  <w:style w:type="paragraph" w:styleId="Footer">
+    <w:name w:val="footer"/>
+    <w:basedOn w:val="Normal"/>
+    <w:link w:val="FooterChar"/>
+    <w:uiPriority w:val="99"/>
+    <w:unhideWhenUsed/>
+    <w:rsid w:val="00E866E3"/>
+    <w:pPr>
+      <w:tabs>
+        <w:tab w:val="center" w:pos="4680"/>
+        <w:tab w:val="right" w:pos="9360"/>
+      </w:tabs>
+      <w:spacing w:after="0" w:line="240" w:lineRule="auto"/>
+    </w:pPr>
+  </w:style>
+  <w:style w:type="character" w:customStyle="1" w:styleId="FooterChar">
+    <w:name w:val="Footer Char"/>
+    <w:basedOn w:val="DefaultParagraphFont"/>
+    <w:link w:val="Footer"/>
+    <w:uiPriority w:val="99"/>
+    <w:rsid w:val="00E866E3"/>
+  </w:style>
 </w:styles>
 </file>
 

</xml_diff>